<commit_message>
Correct user manual against current system behavior
Fix OS minimums (iOS 13.0+), login lockout (3 attempts, 30 minutes), idle timeouts (15 minutes with 2-minute warning; beneficiary app locks at 5 minutes), offline queue behaviour, dispute types, audit-log retention (5 years), staff navigation labels, and role descriptions. Split the SUSPICIOUS and MANUAL_REVIEW FAQ answers.

Co-authored-by: Copilot <223556219+Copilot@users.noreply.github.com>
</commit_message>
<xml_diff>
--- a/documentation/iDetect_User_Manual_Capstone_Revised.docx
+++ b/documentation/iDetect_User_Manual_Capstone_Revised.docx
@@ -3133,7 +3133,7 @@
               <w:rPr>
                 <w:sz w:val="24"/>
               </w:rPr>
-              <w:t>extraction, validation, flagging, transaction history, compliance reports</w:t>
+              <w:t>extraction, validation, flagging, transaction history, compliance reports, and managing establishment staff accounts (establishment Super User only)</w:t>
             </w:r>
           </w:p>
         </w:tc>
@@ -3224,27 +3224,24 @@
               <w:rPr>
                 <w:sz w:val="24"/>
               </w:rPr>
-              <w:t>Establishment</w:t>
+              <w:t>Establishment provisioning, permit validation, account status, permit-expiry monitoring, refusal reports, callback requests, operational dashboard</w:t>
             </w:r>
             <w:r>
               <w:rPr>
                 <w:spacing w:val="-17"/>
                 <w:sz w:val="24"/>
               </w:rPr>
-              <w:t> </w:t>
-            </w:r>
-            <w:r>
-              <w:rPr>
-                <w:sz w:val="24"/>
-              </w:rPr>
-              <w:t>provisioning, permit validation, account status, permit-expiry monitoring, operational </w:t>
+            </w:r>
+            <w:r>
+              <w:rPr>
+                <w:sz w:val="24"/>
+              </w:rPr>
             </w:r>
             <w:r>
               <w:rPr>
                 <w:spacing w:val="-2"/>
                 <w:sz w:val="24"/>
               </w:rPr>
-              <w:t>dashboard</w:t>
             </w:r>
           </w:p>
         </w:tc>
@@ -3593,53 +3590,46 @@
               <w:rPr>
                 <w:sz w:val="24"/>
               </w:rPr>
-              <w:t>Optional</w:t>
+              <w:t>Optional account, status monitoring, notifications, history, disputes, fraud reporting on my ID, callback requests to BPLO</w:t>
             </w:r>
             <w:r>
               <w:rPr>
                 <w:spacing w:val="-13"/>
                 <w:sz w:val="24"/>
               </w:rPr>
-              <w:t> </w:t>
-            </w:r>
-            <w:r>
-              <w:rPr>
-                <w:sz w:val="24"/>
-              </w:rPr>
-              <w:t>account,</w:t>
+            </w:r>
+            <w:r>
+              <w:rPr>
+                <w:sz w:val="24"/>
+              </w:rPr>
             </w:r>
             <w:r>
               <w:rPr>
                 <w:spacing w:val="-13"/>
                 <w:sz w:val="24"/>
               </w:rPr>
-              <w:t> </w:t>
-            </w:r>
-            <w:r>
-              <w:rPr>
-                <w:sz w:val="24"/>
-              </w:rPr>
-              <w:t>status monitoring,</w:t>
+            </w:r>
+            <w:r>
+              <w:rPr>
+                <w:sz w:val="24"/>
+              </w:rPr>
             </w:r>
             <w:r>
               <w:rPr>
                 <w:spacing w:val="-17"/>
                 <w:sz w:val="24"/>
               </w:rPr>
-              <w:t> </w:t>
-            </w:r>
-            <w:r>
-              <w:rPr>
-                <w:sz w:val="24"/>
-              </w:rPr>
-              <w:t>notifications, history, disputes, </w:t>
+            </w:r>
+            <w:r>
+              <w:rPr>
+                <w:sz w:val="24"/>
+              </w:rPr>
             </w:r>
             <w:r>
               <w:rPr>
                 <w:spacing w:val="-2"/>
                 <w:sz w:val="24"/>
               </w:rPr>
-              <w:t>fraud/unauthorized-use reporting</w:t>
             </w:r>
           </w:p>
         </w:tc>
@@ -4354,6 +4344,36 @@
           <w:sz w:val="24"/>
         </w:rPr>
         <w:t>optional.</w:t>
+      </w:r>
+    </w:p>
+    <w:p>
+      <w:pPr>
+        <w:pStyle w:val="ListParagraph"/>
+        <w:numPr>
+          <w:ilvl w:val="2"/>
+          <w:numId w:val="2"/>
+        </w:numPr>
+        <w:tabs>
+          <w:tab w:pos="647" w:val="left" w:leader="none"/>
+        </w:tabs>
+        <w:spacing w:line="240" w:lineRule="auto" w:before="0" w:after="0"/>
+        <w:ind w:left="647" w:right="0" w:hanging="360"/>
+        <w:jc w:val="left"/>
+        <w:rPr>
+          <w:sz w:val="24"/>
+        </w:rPr>
+      </w:pPr>
+      <w:r>
+        <w:rPr>
+          <w:sz w:val="24"/>
+        </w:rPr>
+        <w:t>Each agency (BPLO, OSCA, PDAO) has its own Super Admin account, which manages only its matching administrator role. Each establishment has a Super User who manages its staff accounts and approves pending users. There is no overall Super Admin across agencies.</w:t>
+      </w:r>
+      <w:r>
+        <w:rPr>
+          <w:spacing w:val="-2"/>
+          <w:sz w:val="24"/>
+        </w:rPr>
       </w:r>
     </w:p>
     <w:p>
@@ -4991,7 +5011,7 @@
               <w:rPr>
                 <w:sz w:val="24"/>
               </w:rPr>
-              <w:t>Mobile app for establishment staff; use an administrator-approved Android/iOS package. Check the package listing for its minimum OS version.</w:t>
+              <w:t>Mobile app for establishment staff; use an administrator-approved Android/iOS package. iOS 13.0 or later; confirm the Android minimum in the package listing.</w:t>
             </w:r>
             <w:r>
               <w:rPr>
@@ -6266,59 +6286,51 @@
               <w:rPr>
                 <w:sz w:val="24"/>
               </w:rPr>
-              <w:t>Android</w:t>
+              <w:t>Android (version as stated in the approved app package) or iOS 13.0+ with working camera</w:t>
             </w:r>
             <w:r>
               <w:rPr>
                 <w:spacing w:val="-10"/>
                 <w:sz w:val="24"/>
               </w:rPr>
-              <w:t> </w:t>
-            </w:r>
-            <w:r>
-              <w:rPr>
-                <w:sz w:val="24"/>
-              </w:rPr>
-              <w:t>8.0+</w:t>
+            </w:r>
+            <w:r>
+              <w:rPr>
+                <w:sz w:val="24"/>
+              </w:rPr>
             </w:r>
             <w:r>
               <w:rPr>
                 <w:spacing w:val="-10"/>
                 <w:sz w:val="24"/>
               </w:rPr>
-              <w:t> </w:t>
-            </w:r>
-            <w:r>
-              <w:rPr>
-                <w:sz w:val="24"/>
-              </w:rPr>
-              <w:t>or</w:t>
+            </w:r>
+            <w:r>
+              <w:rPr>
+                <w:sz w:val="24"/>
+              </w:rPr>
             </w:r>
             <w:r>
               <w:rPr>
                 <w:spacing w:val="-10"/>
                 <w:sz w:val="24"/>
               </w:rPr>
-              <w:t> </w:t>
-            </w:r>
-            <w:r>
-              <w:rPr>
-                <w:sz w:val="24"/>
-              </w:rPr>
-              <w:t>iOS</w:t>
+            </w:r>
+            <w:r>
+              <w:rPr>
+                <w:sz w:val="24"/>
+              </w:rPr>
             </w:r>
             <w:r>
               <w:rPr>
                 <w:spacing w:val="-10"/>
                 <w:sz w:val="24"/>
               </w:rPr>
-              <w:t> </w:t>
-            </w:r>
-            <w:r>
-              <w:rPr>
-                <w:sz w:val="24"/>
-              </w:rPr>
-              <w:t>12.0+ with working camera</w:t>
+            </w:r>
+            <w:r>
+              <w:rPr>
+                <w:sz w:val="24"/>
+              </w:rPr>
             </w:r>
           </w:p>
         </w:tc>
@@ -7384,7 +7396,7 @@
       </w:pPr>
       <w:r>
         <w:rPr/>
-        <w:t>Live verification needs an internet connection. The Client Portal can queue scans or flags during some connection interruptions and retry synchronization after reconnection. A queued item is not the same as a completed server check or successfully delivered report. Cached status can be old, and a queued scan can be dropped after repeated failures. Do not rely on an offline or cached result as a current official confirmation; reconnect, check the sync/history status, and ask a supervisor if the result is still pending.</w:t>
+        <w:t>Live verification needs an internet connection. The Client Portal can queue scans or flags during some connection interruptions and retry synchronization after reconnection. A queued item is not the same as a completed server check or successfully delivered report. Cached status can be old, and queued scans are not discarded. After five failed synchronization attempts the app alerts staff to check the item, and synchronization keeps retrying. Do not rely on an offline or cached result as a current official confirmation; reconnect, check the sync/history status, and ask a supervisor if the result is still pending.</w:t>
       </w:r>
       <w:r>
         <w:rPr>
@@ -16297,7 +16309,7 @@
       </w:pPr>
       <w:r>
         <w:rPr/>
-        <w:t>Use Beneficiaries to search or open a record within your office’s scope. Add, import, or correct information only from an authorized source and follow the screen’s validation/confirmation steps. Sensitive values may be masked; opening protected details can require you to re-enter your password and is recorded in the audit trail.</w:t>
+        <w:t>Use Senior Citizens to search or open a record within your office’s scope. Add, import, or correct information only from an authorized source and follow the screen’s validation/confirmation steps. Sensitive values may be masked; opening protected details can require you to re-enter your password and is recorded in the audit trail.</w:t>
       </w:r>
       <w:r>
         <w:rPr>
@@ -18295,7 +18307,7 @@
       </w:pPr>
       <w:r>
         <w:rPr/>
-        <w:t>Select the closest category shown: wrong denial, unauthorized use, business refusal, incorrect record information, or Other. The case is routed to BPLO or the beneficiary’s OSCA/PDAO office according to its type.</w:t>
+        <w:t>Select the closest category shown: Wrong Denial, Business Refusal, Incorrect Database Info, or Other. To report that someone used or copied your ID, use Report Fraud on My ID instead (Unauthorized Use, Stolen ID, Fake/Cloned ID, or Other). An establishment can also file a dispute on your behalf; it appears in your Disputes list as filed for you, and you can acknowledge the response. The case is routed to BPLO or the beneficiary’s OSCA/PDAO office according to its type.</w:t>
       </w:r>
       <w:r>
         <w:rPr>
@@ -20857,7 +20869,7 @@
       </w:pPr>
       <w:r>
         <w:rPr/>
-        <w:t>When the Client Portal is offline, it cannot perform a new live database check. Some previously synchronized blocked-status information may be available but can be out of date. Scans and flags can be queued for automatic retry after the connection returns; a queued item is not yet a completed check or confirmed report. Scans may be dropped after five unsuccessful synchronization attempts. Reconnect, check History/sync status, and contact a supervisor if an item remains pending. Never rely only on cached or offline results to approve a transaction.</w:t>
+        <w:t>When the Client Portal is offline, it cannot perform a new live database check. Some previously synchronized blocked-status information may be available but can be out of date. Scans and flags can be queued for automatic retry after the connection returns; a queued item is not yet a completed check or confirmed report. Queued scans are never discarded. After five unsuccessful synchronization attempts the app alerts staff to check the item, and synchronization keeps retrying. Reconnect, check History/sync status, and contact a supervisor if an item remains pending. Never rely only on cached or offline results to approve a transaction.</w:t>
       </w:r>
       <w:r>
         <w:rPr>
@@ -22147,59 +22159,51 @@
               <w:rPr>
                 <w:sz w:val="24"/>
               </w:rPr>
-              <w:t>Wait</w:t>
+              <w:t>Wait 30 minutes before trying again, or ask your administrator to unlock the account.</w:t>
             </w:r>
             <w:r>
               <w:rPr>
                 <w:spacing w:val="-12"/>
                 <w:sz w:val="24"/>
               </w:rPr>
-              <w:t> </w:t>
-            </w:r>
-            <w:r>
-              <w:rPr>
-                <w:sz w:val="24"/>
-              </w:rPr>
-              <w:t>for</w:t>
+            </w:r>
+            <w:r>
+              <w:rPr>
+                <w:sz w:val="24"/>
+              </w:rPr>
             </w:r>
             <w:r>
               <w:rPr>
                 <w:spacing w:val="-12"/>
                 <w:sz w:val="24"/>
               </w:rPr>
-              <w:t> </w:t>
-            </w:r>
-            <w:r>
-              <w:rPr>
-                <w:sz w:val="24"/>
-              </w:rPr>
-              <w:t>cooldown</w:t>
+            </w:r>
+            <w:r>
+              <w:rPr>
+                <w:sz w:val="24"/>
+              </w:rPr>
             </w:r>
             <w:r>
               <w:rPr>
                 <w:spacing w:val="-12"/>
                 <w:sz w:val="24"/>
               </w:rPr>
-              <w:t> </w:t>
-            </w:r>
-            <w:r>
-              <w:rPr>
-                <w:sz w:val="24"/>
-              </w:rPr>
-              <w:t>or</w:t>
+            </w:r>
+            <w:r>
+              <w:rPr>
+                <w:sz w:val="24"/>
+              </w:rPr>
             </w:r>
             <w:r>
               <w:rPr>
                 <w:spacing w:val="-12"/>
                 <w:sz w:val="24"/>
               </w:rPr>
-              <w:t> </w:t>
-            </w:r>
-            <w:r>
-              <w:rPr>
-                <w:sz w:val="24"/>
-              </w:rPr>
-              <w:t>contact the proper administrator.</w:t>
+            </w:r>
+            <w:r>
+              <w:rPr>
+                <w:sz w:val="24"/>
+              </w:rPr>
             </w:r>
           </w:p>
         </w:tc>
@@ -23106,20 +23110,6 @@
     </w:p>
     <w:p>
       <w:pPr>
-        <w:pStyle w:val="BodyText"/>
-        <w:spacing w:line="276" w:lineRule="auto" w:before="42"/>
-        <w:ind w:left="287" w:right="403"/>
-      </w:pPr>
-      <w:pPr>
-        <w:pStyle w:val="BodyText"/>
-      </w:pPr>
-      <w:r>
-        <w:rPr/>
-        <w:t>A. No. MANUAL_REVIEW means the app could not safely finish the automatic check. Compare the physical card with the displayed fields and ask a supervisor if the details still do not match.</w:t>
-      </w:r>
-    </w:p>
-    <w:p>
-      <w:pPr>
         <w:pStyle w:val="Heading1"/>
         <w:spacing w:after="0"/>
         <w:sectPr>
@@ -23147,6 +23137,36 @@
     <w:p>
       <w:pPr>
         <w:pStyle w:val="Heading1"/>
+        <w:spacing w:before="200"/>
+        <w:ind w:left="287" w:firstLine="0"/>
+      </w:pPr>
+      <w:r>
+        <w:rPr/>
+        <w:t>Q. What does MANUAL_REVIEW mean?</w:t>
+      </w:r>
+      <w:r>
+        <w:rPr>
+          <w:spacing w:val="-2"/>
+        </w:rPr>
+      </w:r>
+    </w:p>
+    <w:p>
+      <w:pPr>
+        <w:pStyle w:val="BodyText"/>
+        <w:spacing w:line="276" w:lineRule="auto" w:before="42"/>
+        <w:ind w:left="287" w:right="403"/>
+      </w:pPr>
+      <w:pPr>
+        <w:pStyle w:val="BodyText"/>
+      </w:pPr>
+      <w:r>
+        <w:rPr/>
+        <w:t>A. MANUAL_REVIEW means the app could not safely finish the automatic check. Compare the physical card with the displayed fields and ask a supervisor if the details still do not match.</w:t>
+      </w:r>
+    </w:p>
+    <w:p>
+      <w:pPr>
+        <w:pStyle w:val="Heading1"/>
         <w:spacing w:before="241"/>
         <w:ind w:left="287" w:firstLine="0"/>
       </w:pPr>
@@ -23404,7 +23424,7 @@
       </w:pPr>
       <w:r>
         <w:rPr/>
-        <w:t>A. The source documents do not provide an approved retention period. The responsible LGU must set and publish the retention and archival policy; ask your administrator how long a particular record is retained.</w:t>
+        <w:t>A. Live audit logs are kept for 5 years from the date of the event. Older logs are moved to a separate archive by the agency Super Admin. The agency records officer confirms this period against its own records rules.</w:t>
       </w:r>
       <w:r>
         <w:rPr>
@@ -23679,7 +23699,7 @@
         <w:rPr>
           <w:sz w:val="24"/>
         </w:rPr>
-        <w:t>Beneficiaries sign in with their ID number and birthdate, then verify a one-time code. A PIN or device biometric can be set up for later sign-in or to unlock the app, if supported and enabled. The Client Portal and staff website use their own account credentials.</w:t>
+        <w:t>Beneficiaries sign in with their ID number and birthdate, then enter the six-digit one-time code. A four-digit PIN or device biometric can be set up for later sign-in or to unlock the app, if supported and enabled. The Client Portal and staff website use their own account credentials.</w:t>
       </w:r>
       <w:r>
         <w:rPr>
@@ -24029,7 +24049,7 @@
         <w:rPr>
           <w:sz w:val="24"/>
         </w:rPr>
-        <w:t>Staff accounts are signed out after inactivity; the website warns before the timeout. Beneficiary accounts lock the app after about five minutes of inactivity and may sign out after a longer idle period. Unlock with your PIN or enabled device biometric, or choose Sign in again. Always sign out on a shared device.</w:t>
+        <w:t>Staff website and Client Portal accounts are signed out after 15 minutes of inactivity, and a warning appears 2 minutes before. Beneficiary accounts lock the app after 5 minutes of inactivity and are signed out after 15 minutes of inactivity. Unlock with your PIN or enabled device biometric, or choose Sign in again. Always sign out on a shared device.</w:t>
       </w:r>
       <w:r>
         <w:rPr>
@@ -26784,131 +26804,6 @@
                 <w:sz w:val="24"/>
               </w:rPr>
               <w:t>Record the time, screen, and non-sensitive error message; contact your office administrator through its approved channel.</w:t>
-            </w:r>
-          </w:p>
-        </w:tc>
-      </w:tr>
-      <w:tr>
-        <w:trPr>
-          <w:trHeight w:val="760" w:hRule="atLeast"/>
-        </w:trPr>
-        <w:tc>
-          <w:tcPr>
-            <w:tcW w:w="5120" w:type="dxa"/>
-          </w:tcPr>
-          <w:p>
-            <w:pPr>
-              <w:pStyle w:val="TableParagraph"/>
-              <w:spacing w:before="109"/>
-              <w:ind w:left="108"/>
-              <w:rPr>
-                <w:sz w:val="24"/>
-              </w:rPr>
-            </w:pPr>
-            <w:r>
-              <w:rPr>
-                <w:sz w:val="24"/>
-              </w:rPr>
-              <w:t>Escalate persistent </w:t>
-            </w:r>
-            <w:r>
-              <w:rPr>
-                <w:spacing w:val="-2"/>
-                <w:sz w:val="24"/>
-              </w:rPr>
-              <w:t>errors</w:t>
-            </w:r>
-          </w:p>
-        </w:tc>
-        <w:tc>
-          <w:tcPr>
-            <w:tcW w:w="5120" w:type="dxa"/>
-          </w:tcPr>
-          <w:p>
-            <w:pPr>
-              <w:pStyle w:val="TableParagraph"/>
-              <w:spacing w:before="109"/>
-              <w:rPr>
-                <w:sz w:val="24"/>
-              </w:rPr>
-            </w:pPr>
-            <w:r>
-              <w:rPr>
-                <w:sz w:val="24"/>
-              </w:rPr>
-              <w:t>Record the time, screen, and non-sensitive error message; contact your office administrator through its approved channel.</w:t>
-            </w:r>
-            <w:r>
-              <w:rPr>
-                <w:spacing w:val="-7"/>
-                <w:sz w:val="24"/>
-              </w:rPr>
-            </w:r>
-            <w:r>
-              <w:rPr>
-                <w:sz w:val="24"/>
-              </w:rPr>
-            </w:r>
-            <w:r>
-              <w:rPr>
-                <w:spacing w:val="-7"/>
-                <w:sz w:val="24"/>
-              </w:rPr>
-            </w:r>
-            <w:r>
-              <w:rPr>
-                <w:sz w:val="24"/>
-              </w:rPr>
-            </w:r>
-            <w:r>
-              <w:rPr>
-                <w:spacing w:val="-7"/>
-                <w:sz w:val="24"/>
-              </w:rPr>
-            </w:r>
-            <w:r>
-              <w:rPr>
-                <w:sz w:val="24"/>
-              </w:rPr>
-            </w:r>
-            <w:r>
-              <w:rPr>
-                <w:spacing w:val="-7"/>
-                <w:sz w:val="24"/>
-              </w:rPr>
-            </w:r>
-            <w:r>
-              <w:rPr>
-                <w:sz w:val="24"/>
-              </w:rPr>
-            </w:r>
-            <w:r>
-              <w:rPr>
-                <w:spacing w:val="-7"/>
-                <w:sz w:val="24"/>
-              </w:rPr>
-            </w:r>
-            <w:r>
-              <w:rPr>
-                <w:sz w:val="24"/>
-              </w:rPr>
-            </w:r>
-            <w:r>
-              <w:rPr>
-                <w:spacing w:val="-7"/>
-                <w:sz w:val="24"/>
-              </w:rPr>
-            </w:r>
-            <w:r>
-              <w:rPr>
-                <w:sz w:val="24"/>
-              </w:rPr>
-            </w:r>
-            <w:r>
-              <w:rPr>
-                <w:spacing w:val="-2"/>
-                <w:sz w:val="24"/>
-              </w:rPr>
             </w:r>
           </w:p>
         </w:tc>

</xml_diff>